<commit_message>
F2-E3 v1 e levantamento, F2-E5 alinhada à E2 e à E3, decisões renumeradas (D-030 a D-036)
Co-Authored-By: Claude Opus 5.5 <noreply@anthropic.com>
</commit_message>
<xml_diff>
--- a/02_Fase2_O_Mercado/F2-E5_Due_Diligence_ESG/F2-E5_Due_Diligence_ESG_v1.docx
+++ b/02_Fase2_O_Mercado/F2-E5_Due_Diligence_ESG/F2-E5_Due_Diligence_ESG_v1.docx
@@ -1188,7 +1188,7 @@
               <w:pStyle w:val="LumisTabela"/>
             </w:pPr>
             <w:r>
-              <w:t>Até 1,5 vez (hoje: 3,0)</w:t>
+              <w:t>Meta: até 1,5 vez. Limite: 2 vezes (hoje: 3,0)</w:t>
             </w:r>
           </w:p>
         </w:tc>
@@ -1201,7 +1201,7 @@
               <w:pStyle w:val="LumisTabela"/>
             </w:pPr>
             <w:r>
-              <w:t>Revisão humana obrigatória no subgrupo; se persistir, suspensão daquela decisão, como prevê o C2</w:t>
+              <w:t>Acima de 2 vezes, restrição imediata da recomendação automática no subgrupo</w:t>
             </w:r>
           </w:p>
         </w:tc>
@@ -1293,7 +1293,7 @@
               <w:pStyle w:val="LumisTabela"/>
             </w:pPr>
             <w:r>
-              <w:t>E3. Reversão humana por subgrupo (registro do C3)</w:t>
+              <w:t>E3. Reversão humana por subgrupo (registro de revisões)</w:t>
             </w:r>
           </w:p>
         </w:tc>
@@ -1465,22 +1465,13 @@
         <w:pStyle w:val="Legenda"/>
       </w:pPr>
       <w:r>
-        <w:t>Tabela 3. Indicadores de equidade. Limites propostos pela equipe; E1 e E2 retomam os indicadores 1 e 5 da Entrega 2.</w:t>
+        <w:t>Tabela 3. Indicadores de equidade. Limites propostos pela equipe; E1 e E2 retomam os indicadores 1 e 3 da Entrega 2.</w:t>
       </w:r>
     </w:p>
     <w:p>
       <w:pPr/>
       <w:r>
-        <w:t xml:space="preserve">A apuração fica com Yuri Nakamura (Dados), e a decisão de exigir revisão ou suspender o uso fica com o Head of AI Management, coordenador previsto no compromisso C4 </w:t>
-      </w:r>
-      <w:r>
-        <w:rPr>
-          <w:rStyle w:val="TagFonte"/>
-        </w:rPr>
-        <w:t>[fonte: Cap. 2, Quadro 13; F1-E3]</w:t>
-      </w:r>
-      <w:r>
-        <w:t>. Os cargos serão confirmados na Entrega 3.</w:t>
+        <w:t>O limite de 2 vezes e a restrição imediata são os mesmos da Entrega 2. Entre 1,5 e 2 vezes, o subgrupo fica em alerta, com revisão humana de 10% dos casos. Pela linha de responsabilidade da Entrega 3, o responsável por Dados apura, o Head of AI Management decide a revisão ou a restrição e o CTO a executa.</w:t>
       </w:r>
     </w:p>
     <w:p>
@@ -2105,7 +2096,7 @@
               <w:pStyle w:val="LumisTabela"/>
             </w:pPr>
             <w:r>
-              <w:t>P2. % dos acessos a dados de pacientes revisados nos últimos 90 dias (C5)</w:t>
+              <w:t>P2. % dos acessos a dados de pacientes revisados nos últimos 90 dias</w:t>
             </w:r>
           </w:p>
         </w:tc>
@@ -2169,7 +2160,7 @@
               <w:keepNext/>
             </w:pPr>
             <w:r>
-              <w:t>P3. Incidentes de privacidade e dias até a ação corretiva (C5)</w:t>
+              <w:t>P3. Incidentes de privacidade e dias até a ação corretiva</w:t>
             </w:r>
           </w:p>
         </w:tc>
@@ -2228,7 +2219,7 @@
         <w:pStyle w:val="Legenda"/>
       </w:pPr>
       <w:r>
-        <w:t>Tabela 5. Indicadores de privacidade. Responsável: Ana Beatriz Rangel (DPO), até a confirmação na Entrega 3.</w:t>
+        <w:t>Tabela 5. Indicadores de privacidade. Responsável: DPO, como na Entrega 3. P2 e P3 dão número ao compromisso de Segurança e Privacidade.</w:t>
       </w:r>
     </w:p>
     <w:p>
@@ -2444,7 +2435,7 @@
               <w:pStyle w:val="LumisTabela"/>
             </w:pPr>
             <w:r>
-              <w:t>Trimestral, no site da Lumis e no relatório de cada cliente; acompanhamento interno quinzenal, como prevê o C2</w:t>
+              <w:t>Trimestral, no site da Lumis e no relatório de cada cliente; acompanhamento interno quinzenal</w:t>
             </w:r>
           </w:p>
         </w:tc>
@@ -2475,7 +2466,7 @@
               <w:pStyle w:val="LumisTabela"/>
             </w:pPr>
             <w:r>
-              <w:t>Head of AI Management publica; Yuri Nakamura (Dados) apura</w:t>
+              <w:t>Head of AI Management publica; responsável por Dados apura</w:t>
             </w:r>
           </w:p>
         </w:tc>
@@ -2541,7 +2532,7 @@
               <w:keepNext/>
             </w:pPr>
             <w:r>
-              <w:t>Revisão humana obrigatória no subgrupo; suspensão do uso se persistir por dois ciclos quinzenais</w:t>
+              <w:t>Acima de 2 vezes, restrição imediata da recomendação automática no subgrupo</w:t>
             </w:r>
           </w:p>
         </w:tc>
@@ -2589,7 +2580,7 @@
         <w:pStyle w:val="Numerada"/>
       </w:pPr>
       <w:r>
-        <w:t>falso negativo por subgrupo dentro do limite no Brasil, ou com revisão humana obrigatória nos subgrupos acima dele;</w:t>
+        <w:t>falso negativo por subgrupo dentro do limite no Brasil, com a recomendação automática já restrita nos subgrupos acima dele;</w:t>
       </w:r>
     </w:p>
     <w:p>
@@ -2635,7 +2626,7 @@
     <w:p>
       <w:pPr/>
       <w:r>
-        <w:t>Nenhum ponto desta entrega contradiz os compromissos C1 a C5. A entrega dá limite e responsável aos compromissos C2 e C5, e a métrica pública cumpre o C1 com número. As condições acima seguem para o memorando ao conselho como condições prévias ao aporte.</w:t>
+        <w:t>A entrega dá limite e responsável aos compromissos de Não Amplificação de Danos e de Segurança e Privacidade, e a métrica pública dá número ao compromisso de Transparência. Nos subgrupos acima do limite, a restrição é imediata, como a Entrega 2 recomendou, e não espera novas leituras. As condições acima seguem para o memorando ao conselho como condições prévias ao aporte.</w:t>
       </w:r>
     </w:p>
     <w:p>

</xml_diff>